<commit_message>
adding last updates on lectures and solving some logic problems.
</commit_message>
<xml_diff>
--- a/LMS documentation (1).docx
+++ b/LMS documentation (1).docx
@@ -229,7 +229,7 @@
                 <w:sz w:val="22"/>
                 <w:szCs w:val="22"/>
               </w:rPr>
-              <w:t>21038519</w:t>
+              <w:t>21058818</w:t>
             </w:r>
           </w:p>
         </w:tc>
@@ -261,7 +261,7 @@
                 <w:sz w:val="22"/>
                 <w:szCs w:val="22"/>
               </w:rPr>
-              <w:t>Yara Hossam Elden Wahed</w:t>
+              <w:t>Ali Mohsen Abd El Monsef</w:t>
             </w:r>
           </w:p>
         </w:tc>
@@ -284,7 +284,7 @@
             <w:pPr>
               <w:spacing w:line="257" w:lineRule="auto"/>
             </w:pPr>
-            <w:hyperlink r:id="rId5">
+            <w:hyperlink r:id="rId5" w:history="1">
               <w:r>
                 <w:rPr>
                   <w:rStyle w:val="Hyperlink"/>
@@ -294,7 +294,7 @@
                   <w:sz w:val="22"/>
                   <w:szCs w:val="22"/>
                 </w:rPr>
-                <w:t>yarahossam97591@gmail.com</w:t>
+                <w:t>ali.m.abdelmonsef@gmail.com</w:t>
               </w:r>
             </w:hyperlink>
           </w:p>
@@ -744,7 +744,7 @@
                 <w:sz w:val="22"/>
                 <w:szCs w:val="22"/>
               </w:rPr>
-              <w:t>21058818</w:t>
+              <w:t>21038519</w:t>
             </w:r>
           </w:p>
         </w:tc>
@@ -776,7 +776,7 @@
                 <w:sz w:val="22"/>
                 <w:szCs w:val="22"/>
               </w:rPr>
-              <w:t>Ali Mohsen Abd El Monsef</w:t>
+              <w:t>Yara Hossam Elden Wahed</w:t>
             </w:r>
           </w:p>
         </w:tc>
@@ -809,7 +809,7 @@
                   <w:sz w:val="22"/>
                   <w:szCs w:val="22"/>
                 </w:rPr>
-                <w:t>ali.m.abdelmonsef@gmail.com</w:t>
+                <w:t>yarahossam97591@gmail.com</w:t>
               </w:r>
             </w:hyperlink>
           </w:p>
@@ -3995,7 +3995,43 @@
           <w:sz w:val="24"/>
           <w:szCs w:val="24"/>
         </w:rPr>
-        <w:t>Development: Java/Spring Boot, MySQL, HTML/CSS/JS.</w:t>
+        <w:t xml:space="preserve">Development: </w:t>
+      </w:r>
+      <w:r>
+        <w:rPr>
+          <w:rFonts w:asciiTheme="minorHAnsi" w:eastAsiaTheme="minorEastAsia" w:hAnsiTheme="minorHAnsi" w:cstheme="minorBidi"/>
+          <w:color w:val="auto"/>
+          <w:sz w:val="24"/>
+          <w:szCs w:val="24"/>
+        </w:rPr>
+        <w:t>C#</w:t>
+      </w:r>
+      <w:r>
+        <w:rPr>
+          <w:rFonts w:asciiTheme="minorHAnsi" w:eastAsiaTheme="minorEastAsia" w:hAnsiTheme="minorHAnsi" w:cstheme="minorBidi"/>
+          <w:color w:val="auto"/>
+          <w:sz w:val="24"/>
+          <w:szCs w:val="24"/>
+        </w:rPr>
+        <w:t xml:space="preserve">, </w:t>
+      </w:r>
+      <w:r>
+        <w:rPr>
+          <w:rFonts w:asciiTheme="minorHAnsi" w:eastAsiaTheme="minorEastAsia" w:hAnsiTheme="minorHAnsi" w:cstheme="minorBidi"/>
+          <w:color w:val="auto"/>
+          <w:sz w:val="24"/>
+          <w:szCs w:val="24"/>
+        </w:rPr>
+        <w:t>SQL Server</w:t>
+      </w:r>
+      <w:r>
+        <w:rPr>
+          <w:rFonts w:asciiTheme="minorHAnsi" w:eastAsiaTheme="minorEastAsia" w:hAnsiTheme="minorHAnsi" w:cstheme="minorBidi"/>
+          <w:color w:val="auto"/>
+          <w:sz w:val="24"/>
+          <w:szCs w:val="24"/>
+        </w:rPr>
+        <w:t>, HTML/CSS/JS.</w:t>
       </w:r>
     </w:p>
     <w:p>
@@ -4070,7 +4106,43 @@
           <w:sz w:val="24"/>
           <w:szCs w:val="24"/>
         </w:rPr>
-        <w:t>Testing: JUnit, manual test cases.</w:t>
+        <w:t xml:space="preserve">Testing: </w:t>
+      </w:r>
+      <w:r>
+        <w:rPr>
+          <w:rFonts w:asciiTheme="minorHAnsi" w:eastAsiaTheme="minorEastAsia" w:hAnsiTheme="minorHAnsi" w:cstheme="minorBidi"/>
+          <w:color w:val="auto"/>
+          <w:sz w:val="24"/>
+          <w:szCs w:val="24"/>
+        </w:rPr>
+        <w:t>Mock-</w:t>
+      </w:r>
+      <w:r>
+        <w:rPr>
+          <w:rFonts w:asciiTheme="minorHAnsi" w:eastAsiaTheme="minorEastAsia" w:hAnsiTheme="minorHAnsi" w:cstheme="minorBidi"/>
+          <w:color w:val="auto"/>
+          <w:sz w:val="24"/>
+          <w:szCs w:val="24"/>
+        </w:rPr>
+        <w:t>Unit</w:t>
+      </w:r>
+      <w:r>
+        <w:rPr>
+          <w:rFonts w:asciiTheme="minorHAnsi" w:eastAsiaTheme="minorEastAsia" w:hAnsiTheme="minorHAnsi" w:cstheme="minorBidi"/>
+          <w:color w:val="auto"/>
+          <w:sz w:val="24"/>
+          <w:szCs w:val="24"/>
+        </w:rPr>
+        <w:t xml:space="preserve"> Testing</w:t>
+      </w:r>
+      <w:r>
+        <w:rPr>
+          <w:rFonts w:asciiTheme="minorHAnsi" w:eastAsiaTheme="minorEastAsia" w:hAnsiTheme="minorHAnsi" w:cstheme="minorBidi"/>
+          <w:color w:val="auto"/>
+          <w:sz w:val="24"/>
+          <w:szCs w:val="24"/>
+        </w:rPr>
+        <w:t>, manual test cases.</w:t>
       </w:r>
     </w:p>
     <w:p/>
@@ -22312,7 +22384,7 @@
         </w:rPr>
         <w:lastRenderedPageBreak/>
         <w:drawing>
-          <wp:inline distT="0" distB="0" distL="0" distR="0" wp14:anchorId="3DF50D17" wp14:editId="18DC4AC7">
+          <wp:inline distT="0" distB="0" distL="0" distR="0" wp14:anchorId="3DF50D17" wp14:editId="74A05CEA">
             <wp:extent cx="5943600" cy="4945380"/>
             <wp:effectExtent l="0" t="0" r="0" b="7620"/>
             <wp:docPr id="1612606861" name="Picture 3" descr="A diagram of a project&#10;&#10;Description automatically generated"/>
@@ -22708,6 +22780,22 @@
       </w:r>
     </w:p>
     <w:p/>
+    <w:p/>
+    <w:p/>
+    <w:p/>
+    <w:p>
+      <w:r>
+        <w:t xml:space="preserve">Diagrams </w:t>
+      </w:r>
+      <w:hyperlink r:id="rId26" w:anchor="G1jIzw7GsekpyThXamL1hXkT3lMEb1W8V1" w:history="1">
+        <w:r>
+          <w:rPr>
+            <w:rStyle w:val="Hyperlink"/>
+          </w:rPr>
+          <w:t>Link</w:t>
+        </w:r>
+      </w:hyperlink>
+    </w:p>
     <w:sectPr>
       <w:pgSz w:w="12240" w:h="15840"/>
       <w:pgMar w:top="1440" w:right="1440" w:bottom="1440" w:left="1440" w:header="720" w:footer="720" w:gutter="0"/>
@@ -28814,6 +28902,30 @@
       </w:tblBorders>
     </w:tblPr>
   </w:style>
+  <w:style w:type="character" w:styleId="UnresolvedMention">
+    <w:name w:val="Unresolved Mention"/>
+    <w:basedOn w:val="DefaultParagraphFont"/>
+    <w:uiPriority w:val="99"/>
+    <w:semiHidden/>
+    <w:unhideWhenUsed/>
+    <w:rsid w:val="00445726"/>
+    <w:rPr>
+      <w:color w:val="605E5C"/>
+      <w:shd w:val="clear" w:color="auto" w:fill="E1DFDD"/>
+    </w:rPr>
+  </w:style>
+  <w:style w:type="character" w:styleId="FollowedHyperlink">
+    <w:name w:val="FollowedHyperlink"/>
+    <w:basedOn w:val="DefaultParagraphFont"/>
+    <w:uiPriority w:val="99"/>
+    <w:semiHidden/>
+    <w:unhideWhenUsed/>
+    <w:rsid w:val="00445726"/>
+    <w:rPr>
+      <w:color w:val="96607D" w:themeColor="followedHyperlink"/>
+      <w:u w:val="single"/>
+    </w:rPr>
+  </w:style>
 </w:styles>
 </file>
 

</xml_diff>